<commit_message>
correccion de la demo final
</commit_message>
<xml_diff>
--- a/docs/guion_demo.docx
+++ b/docs/guion_demo.docx
@@ -748,13 +748,6 @@
         <w:t xml:space="preserve">más antes de la clase</w:t>
       </w:r>
     </w:p>
-    <w:p>
-      <w:r>
-        <w:pict>
-          <v:rect style="width:0;height:1.5pt" o:hralign="center" o:hrstd="t" o:hr="t"/>
-        </w:pict>
-      </w:r>
-    </w:p>
     <w:bookmarkEnd w:id="21"/>
     <w:bookmarkStart w:id="24" w:name="demo-1-el-inventario-fantasma"/>
     <w:p>
@@ -1221,13 +1214,6 @@
         <w:t xml:space="preserve">timeout de lectura, porque decrementar el cupo no es una operación idempotente.”</w:t>
       </w:r>
     </w:p>
-    <w:p>
-      <w:r>
-        <w:pict>
-          <v:rect style="width:0;height:1.5pt" o:hralign="center" o:hrstd="t" o:hr="t"/>
-        </w:pict>
-      </w:r>
-    </w:p>
     <w:bookmarkEnd w:id="23"/>
     <w:bookmarkEnd w:id="24"/>
     <w:bookmarkStart w:id="27" w:name="demo-2-la-pasarela-lenta"/>
@@ -1760,13 +1746,6 @@
         <w:t xml:space="preserve">réplica), no es un bug.</w:t>
       </w:r>
     </w:p>
-    <w:p>
-      <w:r>
-        <w:pict>
-          <v:rect style="width:0;height:1.5pt" o:hralign="center" o:hrstd="t" o:hr="t"/>
-        </w:pict>
-      </w:r>
-    </w:p>
     <w:bookmarkEnd w:id="26"/>
     <w:bookmarkEnd w:id="27"/>
     <w:bookmarkStart w:id="30" w:name="demo-3-el-correo-perdido"/>
@@ -2170,13 +2149,6 @@
         <w:t xml:space="preserve">transitorio, y si sigue fallando, se degrada explícitamente sin bloquear al usuario.”</w:t>
       </w:r>
     </w:p>
-    <w:p>
-      <w:r>
-        <w:pict>
-          <v:rect style="width:0;height:1.5pt" o:hralign="center" o:hrstd="t" o:hr="t"/>
-        </w:pict>
-      </w:r>
-    </w:p>
     <w:bookmarkEnd w:id="29"/>
     <w:bookmarkEnd w:id="30"/>
     <w:bookmarkStart w:id="33" w:name="demo-4-base-de-datos-intermitente"/>
@@ -2662,13 +2634,6 @@
       </w:r>
       <w:r>
         <w:t xml:space="preserve">reutilizarla en el siguiente intento.”</w:t>
-      </w:r>
-    </w:p>
-    <w:p>
-      <w:r>
-        <w:pict>
-          <v:rect style="width:0;height:1.5pt" o:hralign="center" o:hrstd="t" o:hr="t"/>
-        </w:pict>
       </w:r>
     </w:p>
     <w:bookmarkEnd w:id="32"/>

</xml_diff>